<commit_message>
Actualiza informe, presentacion y README del Avance 2
- Informe: CRUD de clientes, normalizacion (seccion 5.4), 9 pruebas,
  34 endpoints y resultados de Postman.
- Presentacion: 34 endpoints, 9 pruebas, evidencias y pendientes.
- README: endpoints de clientes y como correr newman.
</commit_message>
<xml_diff>
--- a/docs/avance-2/Informe_Avance_2_CRM_Cobranzas.docx
+++ b/docs/avance-2/Informe_Avance_2_CRM_Cobranzas.docx
@@ -665,13 +665,13 @@
           <w:b/>
           <w:bCs/>
         </w:rPr>
-        <w:t xml:space="preserve">31 endpoints</w:t>
-      </w:r>
-      <w:r>
-        <w:rPr>
-          <w:rFonts w:ascii="Arial" w:cs="Arial" w:eastAsia="Arial" w:hAnsi="Arial"/>
-        </w:rPr>
-        <w:t xml:space="preserve">, con operaciones de creación, lectura, actualización y borrado lógico. Las </w:t>
+        <w:t xml:space="preserve">34 endpoints</w:t>
+      </w:r>
+      <w:r>
+        <w:rPr>
+          <w:rFonts w:ascii="Arial" w:cs="Arial" w:eastAsia="Arial" w:hAnsi="Arial"/>
+        </w:rPr>
+        <w:t xml:space="preserve">, con creación, lectura, actualización y baja. Las </w:t>
       </w:r>
       <w:r>
         <w:rPr>
@@ -679,13 +679,27 @@
           <w:b/>
           <w:bCs/>
         </w:rPr>
-        <w:t xml:space="preserve">7 pruebas de integración</w:t>
-      </w:r>
-      <w:r>
-        <w:rPr>
-          <w:rFonts w:ascii="Arial" w:cs="Arial" w:eastAsia="Arial" w:hAnsi="Arial"/>
-        </w:rPr>
-        <w:t xml:space="preserve"> automatizadas pasan sin fallos.</w:t>
+        <w:t xml:space="preserve">9 pruebas de integración</w:t>
+      </w:r>
+      <w:r>
+        <w:rPr>
+          <w:rFonts w:ascii="Arial" w:cs="Arial" w:eastAsia="Arial" w:hAnsi="Arial"/>
+        </w:rPr>
+        <w:t xml:space="preserve"> automatizadas pasan sin fallos, y las </w:t>
+      </w:r>
+      <w:r>
+        <w:rPr>
+          <w:rFonts w:ascii="Arial" w:cs="Arial" w:eastAsia="Arial" w:hAnsi="Arial"/>
+          <w:b/>
+          <w:bCs/>
+        </w:rPr>
+        <w:t xml:space="preserve">34 peticiones</w:t>
+      </w:r>
+      <w:r>
+        <w:rPr>
+          <w:rFonts w:ascii="Arial" w:cs="Arial" w:eastAsia="Arial" w:hAnsi="Arial"/>
+        </w:rPr>
+        <w:t xml:space="preserve"> de la colección de Postman también pasan.</w:t>
       </w:r>
     </w:p>
     <w:p>
@@ -1674,7 +1688,7 @@
                 <w:sz w:val="17"/>
                 <w:szCs w:val="17"/>
               </w:rPr>
-              <w:t xml:space="preserve">Implementado (7 pruebas)</w:t>
+              <w:t xml:space="preserve">Implementado (9 pruebas)</w:t>
             </w:r>
           </w:p>
         </w:tc>
@@ -1901,7 +1915,7 @@
                 <w:sz w:val="17"/>
                 <w:szCs w:val="17"/>
               </w:rPr>
-              <w:t xml:space="preserve">Postman</w:t>
+              <w:t xml:space="preserve">Postman y newman</w:t>
             </w:r>
           </w:p>
         </w:tc>
@@ -1931,7 +1945,7 @@
                 <w:sz w:val="17"/>
                 <w:szCs w:val="17"/>
               </w:rPr>
-              <w:t xml:space="preserve">Pruebas manuales de la API</w:t>
+              <w:t xml:space="preserve">Pruebas de la API desde la colección</w:t>
             </w:r>
           </w:p>
         </w:tc>
@@ -1961,7 +1975,7 @@
                 <w:sz w:val="17"/>
                 <w:szCs w:val="17"/>
               </w:rPr>
-              <w:t xml:space="preserve">Colección en docs/; capturas pendientes</w:t>
+              <w:t xml:space="preserve">Implementado: 34 de 34 peticiones pasan</w:t>
             </w:r>
           </w:p>
         </w:tc>
@@ -10621,6 +10635,125 @@
     </w:p>
     <w:p>
       <w:pPr>
+        <w:pStyle w:val="Heading2"/>
+        <w:keepNext/>
+      </w:pPr>
+      <w:r>
+        <w:rPr>
+          <w:rFonts w:ascii="Arial" w:cs="Arial" w:eastAsia="Arial" w:hAnsi="Arial"/>
+        </w:rPr>
+        <w:t xml:space="preserve">5.4 Normalización</w:t>
+      </w:r>
+    </w:p>
+    <w:p>
+      <w:pPr>
+        <w:spacing w:after="80" w:before="0" w:line="300"/>
+      </w:pPr>
+      <w:r>
+        <w:rPr>
+          <w:rFonts w:ascii="Arial" w:cs="Arial" w:eastAsia="Arial" w:hAnsi="Arial"/>
+        </w:rPr>
+        <w:t xml:space="preserve">El esquema cumple la tercera forma normal (3FN) en lo esencial: cada columna no clave depende de la clave completa de su tabla. Hay excepciones deliberadas que se documentan aquí:</w:t>
+      </w:r>
+    </w:p>
+    <w:p>
+      <w:pPr>
+        <w:pStyle w:val="ListParagraph"/>
+        <w:numPr>
+          <w:ilvl w:val="0"/>
+          <w:numId w:val="2"/>
+        </w:numPr>
+        <w:spacing w:after="80" w:line="290"/>
+      </w:pPr>
+      <w:r>
+        <w:rPr>
+          <w:rFonts w:ascii="Arial" w:cs="Arial" w:eastAsia="Arial" w:hAnsi="Arial"/>
+          <w:b/>
+          <w:bCs/>
+        </w:rPr>
+        <w:t xml:space="preserve">gestiones.telefono</w:t>
+      </w:r>
+      <w:r>
+        <w:rPr>
+          <w:rFonts w:ascii="Arial" w:cs="Arial" w:eastAsia="Arial" w:hAnsi="Arial"/>
+        </w:rPr>
+        <w:t xml:space="preserve"> guarda el número usado en la gestión. El teléfono del cliente puede cambiar, pero el historial debe conservar el dato original.</w:t>
+      </w:r>
+    </w:p>
+    <w:p>
+      <w:pPr>
+        <w:pStyle w:val="ListParagraph"/>
+        <w:numPr>
+          <w:ilvl w:val="0"/>
+          <w:numId w:val="2"/>
+        </w:numPr>
+        <w:spacing w:after="80" w:line="290"/>
+      </w:pPr>
+      <w:r>
+        <w:rPr>
+          <w:rFonts w:ascii="Arial" w:cs="Arial" w:eastAsia="Arial" w:hAnsi="Arial"/>
+          <w:b/>
+          <w:bCs/>
+        </w:rPr>
+        <w:t xml:space="preserve">cuentas.cartera y cuentas.cosecha</w:t>
+      </w:r>
+      <w:r>
+        <w:rPr>
+          <w:rFonts w:ascii="Arial" w:cs="Arial" w:eastAsia="Arial" w:hAnsi="Arial"/>
+        </w:rPr>
+        <w:t xml:space="preserve"> se guardan como texto y no como catálogo, porque todavía no tienen atributos propios. Cuando los tengan, pasan a su propia tabla.</w:t>
+      </w:r>
+    </w:p>
+    <w:p>
+      <w:pPr>
+        <w:pStyle w:val="ListParagraph"/>
+        <w:numPr>
+          <w:ilvl w:val="0"/>
+          <w:numId w:val="2"/>
+        </w:numPr>
+        <w:spacing w:after="80" w:line="290"/>
+      </w:pPr>
+      <w:r>
+        <w:rPr>
+          <w:rFonts w:ascii="Arial" w:cs="Arial" w:eastAsia="Arial" w:hAnsi="Arial"/>
+          <w:b/>
+          <w:bCs/>
+        </w:rPr>
+        <w:t xml:space="preserve">cuentas.entidad</w:t>
+      </w:r>
+      <w:r>
+        <w:rPr>
+          <w:rFonts w:ascii="Arial" w:cs="Arial" w:eastAsia="Arial" w:hAnsi="Arial"/>
+        </w:rPr>
+        <w:t xml:space="preserve"> depende de la cartera (una cartera pertenece a una entidad). Eso es una dependencia transitiva: en 3FN estricta iría en el catálogo de carteras. Se deja así por la carga de archivos, y queda como mejora pendiente.</w:t>
+      </w:r>
+    </w:p>
+    <w:p>
+      <w:pPr>
+        <w:pStyle w:val="ListParagraph"/>
+        <w:numPr>
+          <w:ilvl w:val="0"/>
+          <w:numId w:val="2"/>
+        </w:numPr>
+        <w:spacing w:after="80" w:line="290"/>
+      </w:pPr>
+      <w:r>
+        <w:rPr>
+          <w:rFonts w:ascii="Arial" w:cs="Arial" w:eastAsia="Arial" w:hAnsi="Arial"/>
+          <w:b/>
+          <w:bCs/>
+        </w:rPr>
+        <w:t xml:space="preserve">El saldo no se guarda.</w:t>
+      </w:r>
+      <w:r>
+        <w:rPr>
+          <w:rFonts w:ascii="Arial" w:cs="Arial" w:eastAsia="Arial" w:hAnsi="Arial"/>
+        </w:rPr>
+        <w:t xml:space="preserve"> Se calcula como deuda total menos pagos, para que nunca quede desfasado.</w:t>
+      </w:r>
+    </w:p>
+    <w:p>
+      <w:pPr>
         <w:pStyle w:val="Heading1"/>
         <w:pageBreakBefore/>
       </w:pPr>
@@ -11565,7 +11698,7 @@
         <w:rPr>
           <w:rFonts w:ascii="Arial" w:cs="Arial" w:eastAsia="Arial" w:hAnsi="Arial"/>
         </w:rPr>
-        <w:t xml:space="preserve">La rúbrica pide un CRUD completo. Se cumple en </w:t>
+        <w:t xml:space="preserve">La rúbrica pide un CRUD completo. </w:t>
       </w:r>
       <w:r>
         <w:rPr>
@@ -11573,13 +11706,13 @@
           <w:b/>
           <w:bCs/>
         </w:rPr>
-        <w:t xml:space="preserve">usuarios</w:t>
-      </w:r>
-      <w:r>
-        <w:rPr>
-          <w:rFonts w:ascii="Arial" w:cs="Arial" w:eastAsia="Arial" w:hAnsi="Arial"/>
-        </w:rPr>
-        <w:t xml:space="preserve"> y en </w:t>
+        <w:t xml:space="preserve">Clientes</w:t>
+      </w:r>
+      <w:r>
+        <w:rPr>
+          <w:rFonts w:ascii="Arial" w:cs="Arial" w:eastAsia="Arial" w:hAnsi="Arial"/>
+        </w:rPr>
+        <w:t xml:space="preserve"> y </w:t>
       </w:r>
       <w:r>
         <w:rPr>
@@ -11593,7 +11726,91 @@
         <w:rPr>
           <w:rFonts w:ascii="Arial" w:cs="Arial" w:eastAsia="Arial" w:hAnsi="Arial"/>
         </w:rPr>
-        <w:t xml:space="preserve">. Los demás recursos se crean por flujos del negocio (gestión o carga de archivos) y no se borran físicamente, por trazabilidad.</w:t>
+        <w:t xml:space="preserve"> tienen las cuatro operaciones. </w:t>
+      </w:r>
+      <w:r>
+        <w:rPr>
+          <w:rFonts w:ascii="Arial" w:cs="Arial" w:eastAsia="Arial" w:hAnsi="Arial"/>
+          <w:b/>
+          <w:bCs/>
+        </w:rPr>
+        <w:t xml:space="preserve">Usuarios</w:t>
+      </w:r>
+      <w:r>
+        <w:rPr>
+          <w:rFonts w:ascii="Arial" w:cs="Arial" w:eastAsia="Arial" w:hAnsi="Arial"/>
+        </w:rPr>
+        <w:t xml:space="preserve"> tiene crear, leer y actualizar; su baja es lógica (se desactiva, no se borra). </w:t>
+      </w:r>
+      <w:r>
+        <w:rPr>
+          <w:rFonts w:ascii="Arial" w:cs="Arial" w:eastAsia="Arial" w:hAnsi="Arial"/>
+          <w:b/>
+          <w:bCs/>
+        </w:rPr>
+        <w:t xml:space="preserve">Gestiones</w:t>
+      </w:r>
+      <w:r>
+        <w:rPr>
+          <w:rFonts w:ascii="Arial" w:cs="Arial" w:eastAsia="Arial" w:hAnsi="Arial"/>
+        </w:rPr>
+        <w:t xml:space="preserve">, </w:t>
+      </w:r>
+      <w:r>
+        <w:rPr>
+          <w:rFonts w:ascii="Arial" w:cs="Arial" w:eastAsia="Arial" w:hAnsi="Arial"/>
+          <w:b/>
+          <w:bCs/>
+        </w:rPr>
+        <w:t xml:space="preserve">promesas</w:t>
+      </w:r>
+      <w:r>
+        <w:rPr>
+          <w:rFonts w:ascii="Arial" w:cs="Arial" w:eastAsia="Arial" w:hAnsi="Arial"/>
+        </w:rPr>
+        <w:t xml:space="preserve">, </w:t>
+      </w:r>
+      <w:r>
+        <w:rPr>
+          <w:rFonts w:ascii="Arial" w:cs="Arial" w:eastAsia="Arial" w:hAnsi="Arial"/>
+          <w:b/>
+          <w:bCs/>
+        </w:rPr>
+        <w:t xml:space="preserve">cuentas</w:t>
+      </w:r>
+      <w:r>
+        <w:rPr>
+          <w:rFonts w:ascii="Arial" w:cs="Arial" w:eastAsia="Arial" w:hAnsi="Arial"/>
+        </w:rPr>
+        <w:t xml:space="preserve">, </w:t>
+      </w:r>
+      <w:r>
+        <w:rPr>
+          <w:rFonts w:ascii="Arial" w:cs="Arial" w:eastAsia="Arial" w:hAnsi="Arial"/>
+          <w:b/>
+          <w:bCs/>
+        </w:rPr>
+        <w:t xml:space="preserve">asignaciones</w:t>
+      </w:r>
+      <w:r>
+        <w:rPr>
+          <w:rFonts w:ascii="Arial" w:cs="Arial" w:eastAsia="Arial" w:hAnsi="Arial"/>
+        </w:rPr>
+        <w:t xml:space="preserve"> y </w:t>
+      </w:r>
+      <w:r>
+        <w:rPr>
+          <w:rFonts w:ascii="Arial" w:cs="Arial" w:eastAsia="Arial" w:hAnsi="Arial"/>
+          <w:b/>
+          <w:bCs/>
+        </w:rPr>
+        <w:t xml:space="preserve">pagos</w:t>
+      </w:r>
+      <w:r>
+        <w:rPr>
+          <w:rFonts w:ascii="Arial" w:cs="Arial" w:eastAsia="Arial" w:hAnsi="Arial"/>
+        </w:rPr>
+        <w:t xml:space="preserve"> no se editan ni se borran: se crean por el flujo del negocio (gestión o carga de archivos) y se conservan por trazabilidad.</w:t>
       </w:r>
     </w:p>
     <w:tbl>
@@ -12595,7 +12812,7 @@
                 <w:sz w:val="17"/>
                 <w:szCs w:val="17"/>
               </w:rPr>
-              <w:t xml:space="preserve">Cliente, cuenta, asignación y pago</w:t>
+              <w:t xml:space="preserve">Cliente</w:t>
             </w:r>
           </w:p>
         </w:tc>
@@ -12625,6 +12842,161 @@
                 <w:sz w:val="17"/>
                 <w:szCs w:val="17"/>
               </w:rPr>
+              <w:t xml:space="preserve">POST /api/clientes (administrador)</w:t>
+            </w:r>
+          </w:p>
+        </w:tc>
+        <w:tc>
+          <w:tcPr>
+            <w:tcW w:type="dxa" w:w="2200"/>
+            <w:tcBorders>
+              <w:top w:val="single" w:color="D1D5DB" w:sz="4"/>
+              <w:left w:val="single" w:color="D1D5DB" w:sz="4"/>
+              <w:bottom w:val="single" w:color="D1D5DB" w:sz="4"/>
+              <w:right w:val="single" w:color="D1D5DB" w:sz="4"/>
+            </w:tcBorders>
+            <w:tcMar>
+              <w:top w:type="dxa" w:w="50"/>
+              <w:left w:type="dxa" w:w="90"/>
+              <w:bottom w:type="dxa" w:w="50"/>
+              <w:right w:type="dxa" w:w="90"/>
+            </w:tcMar>
+          </w:tcPr>
+          <w:p>
+            <w:pPr>
+              <w:spacing w:after="0" w:line="260"/>
+            </w:pPr>
+            <w:r>
+              <w:rPr>
+                <w:rFonts w:ascii="Arial" w:cs="Arial" w:eastAsia="Arial" w:hAnsi="Arial"/>
+                <w:sz w:val="17"/>
+                <w:szCs w:val="17"/>
+              </w:rPr>
+              <w:t xml:space="preserve">GET /api/clientes y /api/clientes/{id}</w:t>
+            </w:r>
+          </w:p>
+        </w:tc>
+        <w:tc>
+          <w:tcPr>
+            <w:tcW w:type="dxa" w:w="1965"/>
+            <w:tcBorders>
+              <w:top w:val="single" w:color="D1D5DB" w:sz="4"/>
+              <w:left w:val="single" w:color="D1D5DB" w:sz="4"/>
+              <w:bottom w:val="single" w:color="D1D5DB" w:sz="4"/>
+              <w:right w:val="single" w:color="D1D5DB" w:sz="4"/>
+            </w:tcBorders>
+            <w:tcMar>
+              <w:top w:type="dxa" w:w="50"/>
+              <w:left w:type="dxa" w:w="90"/>
+              <w:bottom w:type="dxa" w:w="50"/>
+              <w:right w:type="dxa" w:w="90"/>
+            </w:tcMar>
+          </w:tcPr>
+          <w:p>
+            <w:pPr>
+              <w:spacing w:after="0" w:line="260"/>
+            </w:pPr>
+            <w:r>
+              <w:rPr>
+                <w:rFonts w:ascii="Arial" w:cs="Arial" w:eastAsia="Arial" w:hAnsi="Arial"/>
+                <w:sz w:val="17"/>
+                <w:szCs w:val="17"/>
+              </w:rPr>
+              <w:t xml:space="preserve">PUT /api/clientes/{id} (quien ve al cliente)</w:t>
+            </w:r>
+          </w:p>
+        </w:tc>
+        <w:tc>
+          <w:tcPr>
+            <w:tcW w:type="dxa" w:w="1673"/>
+            <w:tcBorders>
+              <w:top w:val="single" w:color="D1D5DB" w:sz="4"/>
+              <w:left w:val="single" w:color="D1D5DB" w:sz="4"/>
+              <w:bottom w:val="single" w:color="D1D5DB" w:sz="4"/>
+              <w:right w:val="single" w:color="D1D5DB" w:sz="4"/>
+            </w:tcBorders>
+            <w:tcMar>
+              <w:top w:type="dxa" w:w="50"/>
+              <w:left w:type="dxa" w:w="90"/>
+              <w:bottom w:type="dxa" w:w="50"/>
+              <w:right w:type="dxa" w:w="90"/>
+            </w:tcMar>
+          </w:tcPr>
+          <w:p>
+            <w:pPr>
+              <w:spacing w:after="0" w:line="260"/>
+            </w:pPr>
+            <w:r>
+              <w:rPr>
+                <w:rFonts w:ascii="Arial" w:cs="Arial" w:eastAsia="Arial" w:hAnsi="Arial"/>
+                <w:sz w:val="17"/>
+                <w:szCs w:val="17"/>
+              </w:rPr>
+              <w:t xml:space="preserve">DELETE /api/clientes/{id} (administrador; solo sin cuentas)</w:t>
+            </w:r>
+          </w:p>
+        </w:tc>
+      </w:tr>
+      <w:tr>
+        <w:trPr>
+          <w:cantSplit/>
+        </w:trPr>
+        <w:tc>
+          <w:tcPr>
+            <w:tcW w:type="dxa" w:w="1700"/>
+            <w:tcBorders>
+              <w:top w:val="single" w:color="D1D5DB" w:sz="4"/>
+              <w:left w:val="single" w:color="D1D5DB" w:sz="4"/>
+              <w:bottom w:val="single" w:color="D1D5DB" w:sz="4"/>
+              <w:right w:val="single" w:color="D1D5DB" w:sz="4"/>
+            </w:tcBorders>
+            <w:tcMar>
+              <w:top w:type="dxa" w:w="50"/>
+              <w:left w:type="dxa" w:w="90"/>
+              <w:bottom w:type="dxa" w:w="50"/>
+              <w:right w:type="dxa" w:w="90"/>
+            </w:tcMar>
+          </w:tcPr>
+          <w:p>
+            <w:pPr>
+              <w:spacing w:after="0" w:line="260"/>
+            </w:pPr>
+            <w:r>
+              <w:rPr>
+                <w:rFonts w:ascii="Arial" w:cs="Arial" w:eastAsia="Arial" w:hAnsi="Arial"/>
+                <w:sz w:val="17"/>
+                <w:szCs w:val="17"/>
+              </w:rPr>
+              <w:t xml:space="preserve">Cuenta, asignación y pago</w:t>
+            </w:r>
+          </w:p>
+        </w:tc>
+        <w:tc>
+          <w:tcPr>
+            <w:tcW w:type="dxa" w:w="2100"/>
+            <w:tcBorders>
+              <w:top w:val="single" w:color="D1D5DB" w:sz="4"/>
+              <w:left w:val="single" w:color="D1D5DB" w:sz="4"/>
+              <w:bottom w:val="single" w:color="D1D5DB" w:sz="4"/>
+              <w:right w:val="single" w:color="D1D5DB" w:sz="4"/>
+            </w:tcBorders>
+            <w:tcMar>
+              <w:top w:type="dxa" w:w="50"/>
+              <w:left w:type="dxa" w:w="90"/>
+              <w:bottom w:type="dxa" w:w="50"/>
+              <w:right w:type="dxa" w:w="90"/>
+            </w:tcMar>
+          </w:tcPr>
+          <w:p>
+            <w:pPr>
+              <w:spacing w:after="0" w:line="260"/>
+            </w:pPr>
+            <w:r>
+              <w:rPr>
+                <w:rFonts w:ascii="Arial" w:cs="Arial" w:eastAsia="Arial" w:hAnsi="Arial"/>
+                <w:sz w:val="17"/>
+                <w:szCs w:val="17"/>
+              </w:rPr>
               <w:t xml:space="preserve">Carga de archivos CSV</w:t>
             </w:r>
           </w:p>
@@ -12655,7 +13027,7 @@
                 <w:sz w:val="17"/>
                 <w:szCs w:val="17"/>
               </w:rPr>
-              <w:t xml:space="preserve">GET /api/clientes, /{id}; GET /api/cartera</w:t>
+              <w:t xml:space="preserve">GET /api/cartera</w:t>
             </w:r>
           </w:p>
         </w:tc>
@@ -12909,13 +13281,13 @@
           <w:b/>
           <w:bCs/>
         </w:rPr>
-        <w:t xml:space="preserve">31 endpoints</w:t>
-      </w:r>
-      <w:r>
-        <w:rPr>
-          <w:rFonts w:ascii="Arial" w:cs="Arial" w:eastAsia="Arial" w:hAnsi="Arial"/>
-        </w:rPr>
-        <w:t xml:space="preserve">: 16 GET, 8 POST, 3 PUT, 2 PATCH y 2 DELETE. La columna Rol indica quién puede usar cada operación.</w:t>
+        <w:t xml:space="preserve">34 endpoints</w:t>
+      </w:r>
+      <w:r>
+        <w:rPr>
+          <w:rFonts w:ascii="Arial" w:cs="Arial" w:eastAsia="Arial" w:hAnsi="Arial"/>
+        </w:rPr>
+        <w:t xml:space="preserve">: 16 GET, 9 POST, 4 PUT, 2 PATCH y 3 DELETE. La columna Rol indica quién puede usar cada operación.</w:t>
       </w:r>
     </w:p>
     <w:tbl>
@@ -13732,6 +14104,381 @@
                 <w:sz w:val="17"/>
                 <w:szCs w:val="17"/>
               </w:rPr>
+              <w:t xml:space="preserve">POST</w:t>
+            </w:r>
+          </w:p>
+        </w:tc>
+        <w:tc>
+          <w:tcPr>
+            <w:tcW w:type="dxa" w:w="3300"/>
+            <w:tcBorders>
+              <w:top w:val="single" w:color="D1D5DB" w:sz="4"/>
+              <w:left w:val="single" w:color="D1D5DB" w:sz="4"/>
+              <w:bottom w:val="single" w:color="D1D5DB" w:sz="4"/>
+              <w:right w:val="single" w:color="D1D5DB" w:sz="4"/>
+            </w:tcBorders>
+            <w:tcMar>
+              <w:top w:type="dxa" w:w="50"/>
+              <w:left w:type="dxa" w:w="90"/>
+              <w:bottom w:type="dxa" w:w="50"/>
+              <w:right w:type="dxa" w:w="90"/>
+            </w:tcMar>
+          </w:tcPr>
+          <w:p>
+            <w:pPr>
+              <w:spacing w:after="0" w:line="260"/>
+            </w:pPr>
+            <w:r>
+              <w:rPr>
+                <w:rFonts w:ascii="Arial" w:cs="Arial" w:eastAsia="Arial" w:hAnsi="Arial"/>
+                <w:sz w:val="17"/>
+                <w:szCs w:val="17"/>
+              </w:rPr>
+              <w:t xml:space="preserve">/api/clientes</w:t>
+            </w:r>
+          </w:p>
+        </w:tc>
+        <w:tc>
+          <w:tcPr>
+            <w:tcW w:type="dxa" w:w="2300"/>
+            <w:tcBorders>
+              <w:top w:val="single" w:color="D1D5DB" w:sz="4"/>
+              <w:left w:val="single" w:color="D1D5DB" w:sz="4"/>
+              <w:bottom w:val="single" w:color="D1D5DB" w:sz="4"/>
+              <w:right w:val="single" w:color="D1D5DB" w:sz="4"/>
+            </w:tcBorders>
+            <w:tcMar>
+              <w:top w:type="dxa" w:w="50"/>
+              <w:left w:type="dxa" w:w="90"/>
+              <w:bottom w:type="dxa" w:w="50"/>
+              <w:right w:type="dxa" w:w="90"/>
+            </w:tcMar>
+          </w:tcPr>
+          <w:p>
+            <w:pPr>
+              <w:spacing w:after="0" w:line="260"/>
+            </w:pPr>
+            <w:r>
+              <w:rPr>
+                <w:rFonts w:ascii="Arial" w:cs="Arial" w:eastAsia="Arial" w:hAnsi="Arial"/>
+                <w:sz w:val="17"/>
+                <w:szCs w:val="17"/>
+              </w:rPr>
+              <w:t xml:space="preserve">Administrador</w:t>
+            </w:r>
+          </w:p>
+        </w:tc>
+        <w:tc>
+          <w:tcPr>
+            <w:tcW w:type="dxa" w:w="3038"/>
+            <w:tcBorders>
+              <w:top w:val="single" w:color="D1D5DB" w:sz="4"/>
+              <w:left w:val="single" w:color="D1D5DB" w:sz="4"/>
+              <w:bottom w:val="single" w:color="D1D5DB" w:sz="4"/>
+              <w:right w:val="single" w:color="D1D5DB" w:sz="4"/>
+            </w:tcBorders>
+            <w:tcMar>
+              <w:top w:type="dxa" w:w="50"/>
+              <w:left w:type="dxa" w:w="90"/>
+              <w:bottom w:type="dxa" w:w="50"/>
+              <w:right w:type="dxa" w:w="90"/>
+            </w:tcMar>
+          </w:tcPr>
+          <w:p>
+            <w:pPr>
+              <w:spacing w:after="0" w:line="260"/>
+            </w:pPr>
+            <w:r>
+              <w:rPr>
+                <w:rFonts w:ascii="Arial" w:cs="Arial" w:eastAsia="Arial" w:hAnsi="Arial"/>
+                <w:sz w:val="17"/>
+                <w:szCs w:val="17"/>
+              </w:rPr>
+              <w:t xml:space="preserve">Crea un cliente sin cuentas (documento único)</w:t>
+            </w:r>
+          </w:p>
+        </w:tc>
+      </w:tr>
+      <w:tr>
+        <w:trPr>
+          <w:cantSplit/>
+        </w:trPr>
+        <w:tc>
+          <w:tcPr>
+            <w:tcW w:type="dxa" w:w="1000"/>
+            <w:tcBorders>
+              <w:top w:val="single" w:color="D1D5DB" w:sz="4"/>
+              <w:left w:val="single" w:color="D1D5DB" w:sz="4"/>
+              <w:bottom w:val="single" w:color="D1D5DB" w:sz="4"/>
+              <w:right w:val="single" w:color="D1D5DB" w:sz="4"/>
+            </w:tcBorders>
+            <w:tcMar>
+              <w:top w:type="dxa" w:w="50"/>
+              <w:left w:type="dxa" w:w="90"/>
+              <w:bottom w:type="dxa" w:w="50"/>
+              <w:right w:type="dxa" w:w="90"/>
+            </w:tcMar>
+          </w:tcPr>
+          <w:p>
+            <w:pPr>
+              <w:spacing w:after="0" w:line="260"/>
+            </w:pPr>
+            <w:r>
+              <w:rPr>
+                <w:rFonts w:ascii="Arial" w:cs="Arial" w:eastAsia="Arial" w:hAnsi="Arial"/>
+                <w:sz w:val="17"/>
+                <w:szCs w:val="17"/>
+              </w:rPr>
+              <w:t xml:space="preserve">PUT</w:t>
+            </w:r>
+          </w:p>
+        </w:tc>
+        <w:tc>
+          <w:tcPr>
+            <w:tcW w:type="dxa" w:w="3300"/>
+            <w:tcBorders>
+              <w:top w:val="single" w:color="D1D5DB" w:sz="4"/>
+              <w:left w:val="single" w:color="D1D5DB" w:sz="4"/>
+              <w:bottom w:val="single" w:color="D1D5DB" w:sz="4"/>
+              <w:right w:val="single" w:color="D1D5DB" w:sz="4"/>
+            </w:tcBorders>
+            <w:tcMar>
+              <w:top w:type="dxa" w:w="50"/>
+              <w:left w:type="dxa" w:w="90"/>
+              <w:bottom w:type="dxa" w:w="50"/>
+              <w:right w:type="dxa" w:w="90"/>
+            </w:tcMar>
+          </w:tcPr>
+          <w:p>
+            <w:pPr>
+              <w:spacing w:after="0" w:line="260"/>
+            </w:pPr>
+            <w:r>
+              <w:rPr>
+                <w:rFonts w:ascii="Arial" w:cs="Arial" w:eastAsia="Arial" w:hAnsi="Arial"/>
+                <w:sz w:val="17"/>
+                <w:szCs w:val="17"/>
+              </w:rPr>
+              <w:t xml:space="preserve">/api/clientes/{id}</w:t>
+            </w:r>
+          </w:p>
+        </w:tc>
+        <w:tc>
+          <w:tcPr>
+            <w:tcW w:type="dxa" w:w="2300"/>
+            <w:tcBorders>
+              <w:top w:val="single" w:color="D1D5DB" w:sz="4"/>
+              <w:left w:val="single" w:color="D1D5DB" w:sz="4"/>
+              <w:bottom w:val="single" w:color="D1D5DB" w:sz="4"/>
+              <w:right w:val="single" w:color="D1D5DB" w:sz="4"/>
+            </w:tcBorders>
+            <w:tcMar>
+              <w:top w:type="dxa" w:w="50"/>
+              <w:left w:type="dxa" w:w="90"/>
+              <w:bottom w:type="dxa" w:w="50"/>
+              <w:right w:type="dxa" w:w="90"/>
+            </w:tcMar>
+          </w:tcPr>
+          <w:p>
+            <w:pPr>
+              <w:spacing w:after="0" w:line="260"/>
+            </w:pPr>
+            <w:r>
+              <w:rPr>
+                <w:rFonts w:ascii="Arial" w:cs="Arial" w:eastAsia="Arial" w:hAnsi="Arial"/>
+                <w:sz w:val="17"/>
+                <w:szCs w:val="17"/>
+              </w:rPr>
+              <w:t xml:space="preserve">Quien ve al cliente</w:t>
+            </w:r>
+          </w:p>
+        </w:tc>
+        <w:tc>
+          <w:tcPr>
+            <w:tcW w:type="dxa" w:w="3038"/>
+            <w:tcBorders>
+              <w:top w:val="single" w:color="D1D5DB" w:sz="4"/>
+              <w:left w:val="single" w:color="D1D5DB" w:sz="4"/>
+              <w:bottom w:val="single" w:color="D1D5DB" w:sz="4"/>
+              <w:right w:val="single" w:color="D1D5DB" w:sz="4"/>
+            </w:tcBorders>
+            <w:tcMar>
+              <w:top w:type="dxa" w:w="50"/>
+              <w:left w:type="dxa" w:w="90"/>
+              <w:bottom w:type="dxa" w:w="50"/>
+              <w:right w:type="dxa" w:w="90"/>
+            </w:tcMar>
+          </w:tcPr>
+          <w:p>
+            <w:pPr>
+              <w:spacing w:after="0" w:line="260"/>
+            </w:pPr>
+            <w:r>
+              <w:rPr>
+                <w:rFonts w:ascii="Arial" w:cs="Arial" w:eastAsia="Arial" w:hAnsi="Arial"/>
+                <w:sz w:val="17"/>
+                <w:szCs w:val="17"/>
+              </w:rPr>
+              <w:t xml:space="preserve">Actualiza nombre, correo y dirección</w:t>
+            </w:r>
+          </w:p>
+        </w:tc>
+      </w:tr>
+      <w:tr>
+        <w:trPr>
+          <w:cantSplit/>
+        </w:trPr>
+        <w:tc>
+          <w:tcPr>
+            <w:tcW w:type="dxa" w:w="1000"/>
+            <w:tcBorders>
+              <w:top w:val="single" w:color="D1D5DB" w:sz="4"/>
+              <w:left w:val="single" w:color="D1D5DB" w:sz="4"/>
+              <w:bottom w:val="single" w:color="D1D5DB" w:sz="4"/>
+              <w:right w:val="single" w:color="D1D5DB" w:sz="4"/>
+            </w:tcBorders>
+            <w:tcMar>
+              <w:top w:type="dxa" w:w="50"/>
+              <w:left w:type="dxa" w:w="90"/>
+              <w:bottom w:type="dxa" w:w="50"/>
+              <w:right w:type="dxa" w:w="90"/>
+            </w:tcMar>
+          </w:tcPr>
+          <w:p>
+            <w:pPr>
+              <w:spacing w:after="0" w:line="260"/>
+            </w:pPr>
+            <w:r>
+              <w:rPr>
+                <w:rFonts w:ascii="Arial" w:cs="Arial" w:eastAsia="Arial" w:hAnsi="Arial"/>
+                <w:sz w:val="17"/>
+                <w:szCs w:val="17"/>
+              </w:rPr>
+              <w:t xml:space="preserve">DELETE</w:t>
+            </w:r>
+          </w:p>
+        </w:tc>
+        <w:tc>
+          <w:tcPr>
+            <w:tcW w:type="dxa" w:w="3300"/>
+            <w:tcBorders>
+              <w:top w:val="single" w:color="D1D5DB" w:sz="4"/>
+              <w:left w:val="single" w:color="D1D5DB" w:sz="4"/>
+              <w:bottom w:val="single" w:color="D1D5DB" w:sz="4"/>
+              <w:right w:val="single" w:color="D1D5DB" w:sz="4"/>
+            </w:tcBorders>
+            <w:tcMar>
+              <w:top w:type="dxa" w:w="50"/>
+              <w:left w:type="dxa" w:w="90"/>
+              <w:bottom w:type="dxa" w:w="50"/>
+              <w:right w:type="dxa" w:w="90"/>
+            </w:tcMar>
+          </w:tcPr>
+          <w:p>
+            <w:pPr>
+              <w:spacing w:after="0" w:line="260"/>
+            </w:pPr>
+            <w:r>
+              <w:rPr>
+                <w:rFonts w:ascii="Arial" w:cs="Arial" w:eastAsia="Arial" w:hAnsi="Arial"/>
+                <w:sz w:val="17"/>
+                <w:szCs w:val="17"/>
+              </w:rPr>
+              <w:t xml:space="preserve">/api/clientes/{id}</w:t>
+            </w:r>
+          </w:p>
+        </w:tc>
+        <w:tc>
+          <w:tcPr>
+            <w:tcW w:type="dxa" w:w="2300"/>
+            <w:tcBorders>
+              <w:top w:val="single" w:color="D1D5DB" w:sz="4"/>
+              <w:left w:val="single" w:color="D1D5DB" w:sz="4"/>
+              <w:bottom w:val="single" w:color="D1D5DB" w:sz="4"/>
+              <w:right w:val="single" w:color="D1D5DB" w:sz="4"/>
+            </w:tcBorders>
+            <w:tcMar>
+              <w:top w:type="dxa" w:w="50"/>
+              <w:left w:type="dxa" w:w="90"/>
+              <w:bottom w:type="dxa" w:w="50"/>
+              <w:right w:type="dxa" w:w="90"/>
+            </w:tcMar>
+          </w:tcPr>
+          <w:p>
+            <w:pPr>
+              <w:spacing w:after="0" w:line="260"/>
+            </w:pPr>
+            <w:r>
+              <w:rPr>
+                <w:rFonts w:ascii="Arial" w:cs="Arial" w:eastAsia="Arial" w:hAnsi="Arial"/>
+                <w:sz w:val="17"/>
+                <w:szCs w:val="17"/>
+              </w:rPr>
+              <w:t xml:space="preserve">Administrador</w:t>
+            </w:r>
+          </w:p>
+        </w:tc>
+        <w:tc>
+          <w:tcPr>
+            <w:tcW w:type="dxa" w:w="3038"/>
+            <w:tcBorders>
+              <w:top w:val="single" w:color="D1D5DB" w:sz="4"/>
+              <w:left w:val="single" w:color="D1D5DB" w:sz="4"/>
+              <w:bottom w:val="single" w:color="D1D5DB" w:sz="4"/>
+              <w:right w:val="single" w:color="D1D5DB" w:sz="4"/>
+            </w:tcBorders>
+            <w:tcMar>
+              <w:top w:type="dxa" w:w="50"/>
+              <w:left w:type="dxa" w:w="90"/>
+              <w:bottom w:type="dxa" w:w="50"/>
+              <w:right w:type="dxa" w:w="90"/>
+            </w:tcMar>
+          </w:tcPr>
+          <w:p>
+            <w:pPr>
+              <w:spacing w:after="0" w:line="260"/>
+            </w:pPr>
+            <w:r>
+              <w:rPr>
+                <w:rFonts w:ascii="Arial" w:cs="Arial" w:eastAsia="Arial" w:hAnsi="Arial"/>
+                <w:sz w:val="17"/>
+                <w:szCs w:val="17"/>
+              </w:rPr>
+              <w:t xml:space="preserve">Elimina el cliente solo si no tiene cuentas</w:t>
+            </w:r>
+          </w:p>
+        </w:tc>
+      </w:tr>
+      <w:tr>
+        <w:trPr>
+          <w:cantSplit/>
+        </w:trPr>
+        <w:tc>
+          <w:tcPr>
+            <w:tcW w:type="dxa" w:w="1000"/>
+            <w:tcBorders>
+              <w:top w:val="single" w:color="D1D5DB" w:sz="4"/>
+              <w:left w:val="single" w:color="D1D5DB" w:sz="4"/>
+              <w:bottom w:val="single" w:color="D1D5DB" w:sz="4"/>
+              <w:right w:val="single" w:color="D1D5DB" w:sz="4"/>
+            </w:tcBorders>
+            <w:tcMar>
+              <w:top w:type="dxa" w:w="50"/>
+              <w:left w:type="dxa" w:w="90"/>
+              <w:bottom w:type="dxa" w:w="50"/>
+              <w:right w:type="dxa" w:w="90"/>
+            </w:tcMar>
+          </w:tcPr>
+          <w:p>
+            <w:pPr>
+              <w:spacing w:after="0" w:line="260"/>
+            </w:pPr>
+            <w:r>
+              <w:rPr>
+                <w:rFonts w:ascii="Arial" w:cs="Arial" w:eastAsia="Arial" w:hAnsi="Arial"/>
+                <w:sz w:val="17"/>
+                <w:szCs w:val="17"/>
+              </w:rPr>
               <w:t xml:space="preserve">GET</w:t>
             </w:r>
           </w:p>
@@ -18612,7 +19359,72 @@
                 <w:sz w:val="17"/>
                 <w:szCs w:val="17"/>
               </w:rPr>
-              <w:t xml:space="preserve">Alta o cambio de usuarios y tipificaciones</w:t>
+              <w:t xml:space="preserve">Alta o cambio de usuarios, clientes y tipificaciones</w:t>
+            </w:r>
+          </w:p>
+        </w:tc>
+      </w:tr>
+      <w:tr>
+        <w:trPr>
+          <w:cantSplit/>
+        </w:trPr>
+        <w:tc>
+          <w:tcPr>
+            <w:tcW w:type="dxa" w:w="3000"/>
+            <w:tcBorders>
+              <w:top w:val="single" w:color="D1D5DB" w:sz="4"/>
+              <w:left w:val="single" w:color="D1D5DB" w:sz="4"/>
+              <w:bottom w:val="single" w:color="D1D5DB" w:sz="4"/>
+              <w:right w:val="single" w:color="D1D5DB" w:sz="4"/>
+            </w:tcBorders>
+            <w:tcMar>
+              <w:top w:type="dxa" w:w="50"/>
+              <w:left w:type="dxa" w:w="90"/>
+              <w:bottom w:type="dxa" w:w="50"/>
+              <w:right w:type="dxa" w:w="90"/>
+            </w:tcMar>
+          </w:tcPr>
+          <w:p>
+            <w:pPr>
+              <w:spacing w:after="0" w:line="260"/>
+            </w:pPr>
+            <w:r>
+              <w:rPr>
+                <w:rFonts w:ascii="Arial" w:cs="Arial" w:eastAsia="Arial" w:hAnsi="Arial"/>
+                <w:sz w:val="17"/>
+                <w:szCs w:val="17"/>
+              </w:rPr>
+              <w:t xml:space="preserve">ELIMINAR</w:t>
+            </w:r>
+          </w:p>
+        </w:tc>
+        <w:tc>
+          <w:tcPr>
+            <w:tcW w:type="dxa" w:w="6638"/>
+            <w:tcBorders>
+              <w:top w:val="single" w:color="D1D5DB" w:sz="4"/>
+              <w:left w:val="single" w:color="D1D5DB" w:sz="4"/>
+              <w:bottom w:val="single" w:color="D1D5DB" w:sz="4"/>
+              <w:right w:val="single" w:color="D1D5DB" w:sz="4"/>
+            </w:tcBorders>
+            <w:tcMar>
+              <w:top w:type="dxa" w:w="50"/>
+              <w:left w:type="dxa" w:w="90"/>
+              <w:bottom w:type="dxa" w:w="50"/>
+              <w:right w:type="dxa" w:w="90"/>
+            </w:tcMar>
+          </w:tcPr>
+          <w:p>
+            <w:pPr>
+              <w:spacing w:after="0" w:line="260"/>
+            </w:pPr>
+            <w:r>
+              <w:rPr>
+                <w:rFonts w:ascii="Arial" w:cs="Arial" w:eastAsia="Arial" w:hAnsi="Arial"/>
+                <w:sz w:val="17"/>
+                <w:szCs w:val="17"/>
+              </w:rPr>
+              <w:t xml:space="preserve">Baja física de un cliente sin cuentas</w:t>
             </w:r>
           </w:p>
         </w:tc>
@@ -19653,6 +20465,196 @@
           </w:p>
         </w:tc>
       </w:tr>
+      <w:tr>
+        <w:trPr>
+          <w:cantSplit/>
+        </w:trPr>
+        <w:tc>
+          <w:tcPr>
+            <w:tcW w:type="dxa" w:w="3100"/>
+            <w:tcBorders>
+              <w:top w:val="single" w:color="D1D5DB" w:sz="4"/>
+              <w:left w:val="single" w:color="D1D5DB" w:sz="4"/>
+              <w:bottom w:val="single" w:color="D1D5DB" w:sz="4"/>
+              <w:right w:val="single" w:color="D1D5DB" w:sz="4"/>
+            </w:tcBorders>
+            <w:tcMar>
+              <w:top w:type="dxa" w:w="50"/>
+              <w:left w:type="dxa" w:w="90"/>
+              <w:bottom w:type="dxa" w:w="50"/>
+              <w:right w:type="dxa" w:w="90"/>
+            </w:tcMar>
+          </w:tcPr>
+          <w:p>
+            <w:pPr>
+              <w:spacing w:after="0" w:line="260"/>
+            </w:pPr>
+            <w:r>
+              <w:rPr>
+                <w:rFonts w:ascii="Arial" w:cs="Arial" w:eastAsia="Arial" w:hAnsi="Arial"/>
+                <w:sz w:val="17"/>
+                <w:szCs w:val="17"/>
+              </w:rPr>
+              <w:t xml:space="preserve">crudClientes_rolesAlcanceYReglas</w:t>
+            </w:r>
+          </w:p>
+        </w:tc>
+        <w:tc>
+          <w:tcPr>
+            <w:tcW w:type="dxa" w:w="1800"/>
+            <w:tcBorders>
+              <w:top w:val="single" w:color="D1D5DB" w:sz="4"/>
+              <w:left w:val="single" w:color="D1D5DB" w:sz="4"/>
+              <w:bottom w:val="single" w:color="D1D5DB" w:sz="4"/>
+              <w:right w:val="single" w:color="D1D5DB" w:sz="4"/>
+            </w:tcBorders>
+            <w:tcMar>
+              <w:top w:type="dxa" w:w="50"/>
+              <w:left w:type="dxa" w:w="90"/>
+              <w:bottom w:type="dxa" w:w="50"/>
+              <w:right w:type="dxa" w:w="90"/>
+            </w:tcMar>
+          </w:tcPr>
+          <w:p>
+            <w:pPr>
+              <w:spacing w:after="0" w:line="260"/>
+            </w:pPr>
+            <w:r>
+              <w:rPr>
+                <w:rFonts w:ascii="Arial" w:cs="Arial" w:eastAsia="Arial" w:hAnsi="Arial"/>
+                <w:sz w:val="17"/>
+                <w:szCs w:val="17"/>
+              </w:rPr>
+              <w:t xml:space="preserve">CRUD (rúbrica)</w:t>
+            </w:r>
+          </w:p>
+        </w:tc>
+        <w:tc>
+          <w:tcPr>
+            <w:tcW w:type="dxa" w:w="4738"/>
+            <w:tcBorders>
+              <w:top w:val="single" w:color="D1D5DB" w:sz="4"/>
+              <w:left w:val="single" w:color="D1D5DB" w:sz="4"/>
+              <w:bottom w:val="single" w:color="D1D5DB" w:sz="4"/>
+              <w:right w:val="single" w:color="D1D5DB" w:sz="4"/>
+            </w:tcBorders>
+            <w:tcMar>
+              <w:top w:type="dxa" w:w="50"/>
+              <w:left w:type="dxa" w:w="90"/>
+              <w:bottom w:type="dxa" w:w="50"/>
+              <w:right w:type="dxa" w:w="90"/>
+            </w:tcMar>
+          </w:tcPr>
+          <w:p>
+            <w:pPr>
+              <w:spacing w:after="0" w:line="260"/>
+            </w:pPr>
+            <w:r>
+              <w:rPr>
+                <w:rFonts w:ascii="Arial" w:cs="Arial" w:eastAsia="Arial" w:hAnsi="Arial"/>
+                <w:sz w:val="17"/>
+                <w:szCs w:val="17"/>
+              </w:rPr>
+              <w:t xml:space="preserve">Solo el administrador crea y elimina clientes. El asesor edita solo los de su cartera (otro asesor recibe 404). No se elimina un cliente con cuentas (409). Un documento repetido responde 409.</w:t>
+            </w:r>
+          </w:p>
+        </w:tc>
+      </w:tr>
+      <w:tr>
+        <w:trPr>
+          <w:cantSplit/>
+        </w:trPr>
+        <w:tc>
+          <w:tcPr>
+            <w:tcW w:type="dxa" w:w="3100"/>
+            <w:tcBorders>
+              <w:top w:val="single" w:color="D1D5DB" w:sz="4"/>
+              <w:left w:val="single" w:color="D1D5DB" w:sz="4"/>
+              <w:bottom w:val="single" w:color="D1D5DB" w:sz="4"/>
+              <w:right w:val="single" w:color="D1D5DB" w:sz="4"/>
+            </w:tcBorders>
+            <w:tcMar>
+              <w:top w:type="dxa" w:w="50"/>
+              <w:left w:type="dxa" w:w="90"/>
+              <w:bottom w:type="dxa" w:w="50"/>
+              <w:right w:type="dxa" w:w="90"/>
+            </w:tcMar>
+          </w:tcPr>
+          <w:p>
+            <w:pPr>
+              <w:spacing w:after="0" w:line="260"/>
+            </w:pPr>
+            <w:r>
+              <w:rPr>
+                <w:rFonts w:ascii="Arial" w:cs="Arial" w:eastAsia="Arial" w:hAnsi="Arial"/>
+                <w:sz w:val="17"/>
+                <w:szCs w:val="17"/>
+              </w:rPr>
+              <w:t xml:space="preserve">rf19_cargaSinArchivoResponde400NoError</w:t>
+            </w:r>
+          </w:p>
+        </w:tc>
+        <w:tc>
+          <w:tcPr>
+            <w:tcW w:type="dxa" w:w="1800"/>
+            <w:tcBorders>
+              <w:top w:val="single" w:color="D1D5DB" w:sz="4"/>
+              <w:left w:val="single" w:color="D1D5DB" w:sz="4"/>
+              <w:bottom w:val="single" w:color="D1D5DB" w:sz="4"/>
+              <w:right w:val="single" w:color="D1D5DB" w:sz="4"/>
+            </w:tcBorders>
+            <w:tcMar>
+              <w:top w:type="dxa" w:w="50"/>
+              <w:left w:type="dxa" w:w="90"/>
+              <w:bottom w:type="dxa" w:w="50"/>
+              <w:right w:type="dxa" w:w="90"/>
+            </w:tcMar>
+          </w:tcPr>
+          <w:p>
+            <w:pPr>
+              <w:spacing w:after="0" w:line="260"/>
+            </w:pPr>
+            <w:r>
+              <w:rPr>
+                <w:rFonts w:ascii="Arial" w:cs="Arial" w:eastAsia="Arial" w:hAnsi="Arial"/>
+                <w:sz w:val="17"/>
+                <w:szCs w:val="17"/>
+              </w:rPr>
+              <w:t xml:space="preserve">RNF07</w:t>
+            </w:r>
+          </w:p>
+        </w:tc>
+        <w:tc>
+          <w:tcPr>
+            <w:tcW w:type="dxa" w:w="4738"/>
+            <w:tcBorders>
+              <w:top w:val="single" w:color="D1D5DB" w:sz="4"/>
+              <w:left w:val="single" w:color="D1D5DB" w:sz="4"/>
+              <w:bottom w:val="single" w:color="D1D5DB" w:sz="4"/>
+              <w:right w:val="single" w:color="D1D5DB" w:sz="4"/>
+            </w:tcBorders>
+            <w:tcMar>
+              <w:top w:type="dxa" w:w="50"/>
+              <w:left w:type="dxa" w:w="90"/>
+              <w:bottom w:type="dxa" w:w="50"/>
+              <w:right w:type="dxa" w:w="90"/>
+            </w:tcMar>
+          </w:tcPr>
+          <w:p>
+            <w:pPr>
+              <w:spacing w:after="0" w:line="260"/>
+            </w:pPr>
+            <w:r>
+              <w:rPr>
+                <w:rFonts w:ascii="Arial" w:cs="Arial" w:eastAsia="Arial" w:hAnsi="Arial"/>
+                <w:sz w:val="17"/>
+                <w:szCs w:val="17"/>
+              </w:rPr>
+              <w:t xml:space="preserve">Una carga sin archivo responde 400 con un mensaje claro, no 500.</w:t>
+            </w:r>
+          </w:p>
+        </w:tc>
+      </w:tr>
     </w:tbl>
     <w:p>
       <w:pPr>
@@ -19687,13 +20689,13 @@
           <w:b/>
           <w:bCs/>
         </w:rPr>
-        <w:t xml:space="preserve">Tests run: 7, Failures: 0, Errors: 0, Skipped: 0 · BUILD SUCCESS</w:t>
-      </w:r>
-      <w:r>
-        <w:rPr>
-          <w:rFonts w:ascii="Arial" w:cs="Arial" w:eastAsia="Arial" w:hAnsi="Arial"/>
-        </w:rPr>
-        <w:t xml:space="preserve">. Antes de agregar el borrado lógico de tipificaciones, la misma suite ejecutaba 6 pruebas y también pasaba todas.</w:t>
+        <w:t xml:space="preserve">Tests run: 9, Failures: 0, Errors: 0, Skipped: 0 · BUILD SUCCESS</w:t>
+      </w:r>
+      <w:r>
+        <w:rPr>
+          <w:rFonts w:ascii="Arial" w:cs="Arial" w:eastAsia="Arial" w:hAnsi="Arial"/>
+        </w:rPr>
+        <w:t xml:space="preserve">.</w:t>
       </w:r>
     </w:p>
     <w:p>
@@ -19705,7 +20707,55 @@
         <w:rPr>
           <w:rFonts w:ascii="Arial" w:cs="Arial" w:eastAsia="Arial" w:hAnsi="Arial"/>
         </w:rPr>
-        <w:t xml:space="preserve">9.3 Pruebas pendientes</w:t>
+        <w:t xml:space="preserve">9.3 Colección de Postman (newman)</w:t>
+      </w:r>
+    </w:p>
+    <w:p>
+      <w:pPr>
+        <w:spacing w:after="140" w:before="0" w:line="300"/>
+      </w:pPr>
+      <w:r>
+        <w:rPr>
+          <w:rFonts w:ascii="Arial" w:cs="Arial" w:eastAsia="Arial" w:hAnsi="Arial"/>
+        </w:rPr>
+        <w:t xml:space="preserve">La colección tiene 34 peticiones, y cada una verifica su código de respuesta. Se ejecutó contra el backend con perfil demo (H2): </w:t>
+      </w:r>
+      <w:r>
+        <w:rPr>
+          <w:rFonts w:ascii="Arial" w:cs="Arial" w:eastAsia="Arial" w:hAnsi="Arial"/>
+          <w:b/>
+          <w:bCs/>
+        </w:rPr>
+        <w:t xml:space="preserve">34 de 34 peticiones y 34 de 34 aserciones pasan</w:t>
+      </w:r>
+      <w:r>
+        <w:rPr>
+          <w:rFonts w:ascii="Arial" w:cs="Arial" w:eastAsia="Arial" w:hAnsi="Arial"/>
+        </w:rPr>
+        <w:t xml:space="preserve">. El reporte completo está en docs/avance-2/postman-resultados.txt.</w:t>
+      </w:r>
+    </w:p>
+    <w:p>
+      <w:pPr>
+        <w:spacing w:after="140" w:before="0" w:line="300"/>
+      </w:pPr>
+      <w:r>
+        <w:rPr>
+          <w:rFonts w:ascii="Arial" w:cs="Arial" w:eastAsia="Arial" w:hAnsi="Arial"/>
+        </w:rPr>
+        <w:t xml:space="preserve">Al ejecutarla, la colección tenía errores que se corrigieron: el token de asesor se usaba para módulos de administración, dos IDs de ejemplo no correspondían a la cartera del asesor, y las cargas sin archivo respondían 500. Además, crear tipificaciones respondía 200 y ahora responde 201.</w:t>
+      </w:r>
+    </w:p>
+    <w:p>
+      <w:pPr>
+        <w:pStyle w:val="Heading2"/>
+        <w:keepNext/>
+      </w:pPr>
+      <w:r>
+        <w:rPr>
+          <w:rFonts w:ascii="Arial" w:cs="Arial" w:eastAsia="Arial" w:hAnsi="Arial"/>
+        </w:rPr>
+        <w:t xml:space="preserve">9.4 Pruebas pendientes</w:t>
       </w:r>
     </w:p>
     <w:p>
@@ -19723,13 +20773,13 @@
           <w:b/>
           <w:bCs/>
         </w:rPr>
-        <w:t xml:space="preserve">Postman (P01–P04 del Avance 1):</w:t>
-      </w:r>
-      <w:r>
-        <w:rPr>
-          <w:rFonts w:ascii="Arial" w:cs="Arial" w:eastAsia="Arial" w:hAnsi="Arial"/>
-        </w:rPr>
-        <w:t xml:space="preserve"> la colección está en docs/CRM-Cobranzas.postman_collection.json. Falta ejecutarla contra la base MySQL y adjuntar las capturas.</w:t>
+        <w:t xml:space="preserve">Ejecución contra MySQL 8 real:</w:t>
+      </w:r>
+      <w:r>
+        <w:rPr>
+          <w:rFonts w:ascii="Arial" w:cs="Arial" w:eastAsia="Arial" w:hAnsi="Arial"/>
+        </w:rPr>
+        <w:t xml:space="preserve"> las pruebas y Postman corren con H2 en modo MySQL. Falta ejecutar 01_esquema.sql en un servidor MySQL 8 y correr el backend con el perfil mysql.</w:t>
       </w:r>
     </w:p>
     <w:p>
@@ -19848,7 +20898,7 @@
         <w:rPr>
           <w:rFonts w:ascii="Arial" w:cs="Arial" w:eastAsia="Arial" w:hAnsi="Arial"/>
         </w:rPr>
-        <w:t xml:space="preserve"> 31 endpoints con creación, lectura, actualización y borrado lógico en usuarios y tipificaciones.</w:t>
+        <w:t xml:space="preserve"> 34 endpoints. CRUD completo en clientes y tipificaciones; usuarios se da de baja de forma lógica.</w:t>
       </w:r>
     </w:p>
     <w:p>
@@ -19920,7 +20970,7 @@
         <w:rPr>
           <w:rFonts w:ascii="Arial" w:cs="Arial" w:eastAsia="Arial" w:hAnsi="Arial"/>
         </w:rPr>
-        <w:t xml:space="preserve"> 7 pruebas de integración automatizadas que pasan.</w:t>
+        <w:t xml:space="preserve"> 9 pruebas de integración automatizadas que pasan, y 34 de 34 peticiones de Postman.</w:t>
       </w:r>
     </w:p>
     <w:p>
@@ -19964,7 +21014,7 @@
         <w:rPr>
           <w:rFonts w:ascii="Arial" w:cs="Arial" w:eastAsia="Arial" w:hAnsi="Arial"/>
         </w:rPr>
-        <w:t xml:space="preserve">Captura de Postman con los casos P01–P04 y de la carga de un CSV con filas aceptadas y rechazadas.</w:t>
+        <w:t xml:space="preserve">Ejecución de 01_esquema.sql en un servidor MySQL 8 real, y del backend con el perfil mysql.</w:t>
       </w:r>
     </w:p>
     <w:p>
@@ -20473,6 +21523,25 @@
           <w:rFonts w:ascii="Arial" w:cs="Arial" w:eastAsia="Arial" w:hAnsi="Arial"/>
         </w:rPr>
         <w:t xml:space="preserve"> Desde la carpeta backend, ejecutar `./mvnw test`. No necesitan MySQL porque usan el perfil demo con H2.</w:t>
+      </w:r>
+    </w:p>
+    <w:p>
+      <w:pPr>
+        <w:spacing w:after="140" w:before="0" w:line="300"/>
+      </w:pPr>
+      <w:r>
+        <w:rPr>
+          <w:rFonts w:ascii="Arial" w:cs="Arial" w:eastAsia="Arial" w:hAnsi="Arial"/>
+          <w:b/>
+          <w:bCs/>
+        </w:rPr>
+        <w:t xml:space="preserve">6. Probar la API con Postman (newman).</w:t>
+      </w:r>
+      <w:r>
+        <w:rPr>
+          <w:rFonts w:ascii="Arial" w:cs="Arial" w:eastAsia="Arial" w:hAnsi="Arial"/>
+        </w:rPr>
+        <w:t xml:space="preserve"> Con el backend en marcha, desde la raíz del proyecto: `newman run docs/CRM-Cobranzas.postman_collection.json --env-var base_url=http://localhost:8080 --working-dir docs`.</w:t>
       </w:r>
     </w:p>
     <w:sectPr>

</xml_diff>